<commit_message>
feat: actualizar plantilla dni
</commit_message>
<xml_diff>
--- a/pesaje/analytica/Report/LoteDniBaseA5.docx
+++ b/pesaje/analytica/Report/LoteDniBaseA5.docx
@@ -5,7 +5,7 @@
     <w:tbl>
       <w:tblPr>
         <w:tblpPr w:leftFromText="141" w:rightFromText="141" w:vertAnchor="page" w:horzAnchor="margin" w:tblpXSpec="center" w:tblpY="271"/>
-        <w:tblW w:w="4779" w:type="pct"/>
+        <w:tblW w:w="4730" w:type="pct"/>
         <w:jc w:val="center"/>
         <w:tblLayout w:type="fixed"/>
         <w:tblCellMar>
@@ -16,13 +16,13 @@
         <w:tblDescription w:val="Tabla de diseño de encabezado"/>
       </w:tblPr>
       <w:tblGrid>
-        <w:gridCol w:w="1813"/>
-        <w:gridCol w:w="1873"/>
+        <w:gridCol w:w="1276"/>
+        <w:gridCol w:w="2298"/>
         <w:gridCol w:w="1659"/>
         <w:gridCol w:w="50"/>
-        <w:gridCol w:w="490"/>
-        <w:gridCol w:w="1598"/>
-        <w:gridCol w:w="1873"/>
+        <w:gridCol w:w="357"/>
+        <w:gridCol w:w="1448"/>
+        <w:gridCol w:w="2156"/>
         <w:gridCol w:w="1625"/>
       </w:tblGrid>
       <w:tr>
@@ -32,7 +32,7 @@
         </w:trPr>
         <w:tc>
           <w:tcPr>
-            <w:tcW w:w="3686" w:type="dxa"/>
+            <w:tcW w:w="3574" w:type="dxa"/>
             <w:gridSpan w:val="2"/>
             <w:tcBorders>
               <w:top w:val="single" w:sz="24" w:space="0" w:color="auto"/>
@@ -81,7 +81,25 @@
                 <w:sz w:val="96"/>
                 <w:szCs w:val="96"/>
               </w:rPr>
-              <w:t>«nro»</w:t>
+              <w:t>«</w:t>
+            </w:r>
+            <w:proofErr w:type="spellStart"/>
+            <w:r>
+              <w:rPr>
+                <w:rFonts w:ascii="Aptos Black" w:hAnsi="Aptos Black"/>
+                <w:sz w:val="96"/>
+                <w:szCs w:val="96"/>
+              </w:rPr>
+              <w:t>nro</w:t>
+            </w:r>
+            <w:proofErr w:type="spellEnd"/>
+            <w:r>
+              <w:rPr>
+                <w:rFonts w:ascii="Aptos Black" w:hAnsi="Aptos Black"/>
+                <w:sz w:val="96"/>
+                <w:szCs w:val="96"/>
+              </w:rPr>
+              <w:t>»</w:t>
             </w:r>
             <w:r>
               <w:rPr>
@@ -399,7 +417,7 @@
         </w:tc>
         <w:tc>
           <w:tcPr>
-            <w:tcW w:w="490" w:type="dxa"/>
+            <w:tcW w:w="357" w:type="dxa"/>
             <w:tcBorders>
               <w:right w:val="single" w:sz="24" w:space="0" w:color="auto"/>
             </w:tcBorders>
@@ -407,7 +425,7 @@
           <w:p>
             <w:pPr>
               <w:spacing w:before="0" w:after="0"/>
-              <w:ind w:left="94"/>
+              <w:ind w:left="75"/>
               <w:rPr>
                 <w:rFonts w:ascii="Aptos Black" w:hAnsi="Aptos Black"/>
                 <w:sz w:val="96"/>
@@ -418,7 +436,7 @@
         </w:tc>
         <w:tc>
           <w:tcPr>
-            <w:tcW w:w="3471" w:type="dxa"/>
+            <w:tcW w:w="3604" w:type="dxa"/>
             <w:gridSpan w:val="2"/>
             <w:tcBorders>
               <w:top w:val="single" w:sz="24" w:space="0" w:color="auto"/>
@@ -759,7 +777,7 @@
         </w:trPr>
         <w:tc>
           <w:tcPr>
-            <w:tcW w:w="3686" w:type="dxa"/>
+            <w:tcW w:w="3574" w:type="dxa"/>
             <w:gridSpan w:val="2"/>
             <w:tcBorders>
               <w:left w:val="single" w:sz="24" w:space="0" w:color="auto"/>
@@ -860,7 +878,7 @@
         </w:tc>
         <w:tc>
           <w:tcPr>
-            <w:tcW w:w="490" w:type="dxa"/>
+            <w:tcW w:w="357" w:type="dxa"/>
             <w:tcBorders>
               <w:right w:val="single" w:sz="24" w:space="0" w:color="auto"/>
             </w:tcBorders>
@@ -878,7 +896,7 @@
         </w:tc>
         <w:tc>
           <w:tcPr>
-            <w:tcW w:w="3471" w:type="dxa"/>
+            <w:tcW w:w="3604" w:type="dxa"/>
             <w:gridSpan w:val="2"/>
             <w:tcBorders>
               <w:left w:val="single" w:sz="24" w:space="0" w:color="auto"/>
@@ -965,7 +983,7 @@
         </w:trPr>
         <w:tc>
           <w:tcPr>
-            <w:tcW w:w="1813" w:type="dxa"/>
+            <w:tcW w:w="1276" w:type="dxa"/>
             <w:tcBorders>
               <w:top w:val="single" w:sz="24" w:space="0" w:color="auto"/>
               <w:left w:val="single" w:sz="24" w:space="0" w:color="auto"/>
@@ -975,7 +993,6 @@
           <w:p>
             <w:pPr>
               <w:spacing w:before="0" w:after="0"/>
-              <w:ind w:left="-202"/>
               <w:jc w:val="center"/>
               <w:rPr>
                 <w:rFonts w:ascii="Aptos Black" w:hAnsi="Aptos Black"/>
@@ -995,7 +1012,7 @@
         </w:tc>
         <w:tc>
           <w:tcPr>
-            <w:tcW w:w="1873" w:type="dxa"/>
+            <w:tcW w:w="2298" w:type="dxa"/>
             <w:tcBorders>
               <w:top w:val="single" w:sz="24" w:space="0" w:color="auto"/>
               <w:left w:val="dashed" w:sz="4" w:space="0" w:color="auto"/>
@@ -1005,6 +1022,7 @@
           <w:p>
             <w:pPr>
               <w:spacing w:before="0" w:after="0"/>
+              <w:ind w:left="2" w:right="26"/>
               <w:jc w:val="center"/>
               <w:rPr>
                 <w:rFonts w:ascii="Aptos Black" w:hAnsi="Aptos Black"/>
@@ -1082,7 +1100,7 @@
         </w:tc>
         <w:tc>
           <w:tcPr>
-            <w:tcW w:w="490" w:type="dxa"/>
+            <w:tcW w:w="357" w:type="dxa"/>
             <w:tcBorders>
               <w:right w:val="single" w:sz="24" w:space="0" w:color="auto"/>
             </w:tcBorders>
@@ -1101,7 +1119,7 @@
         </w:tc>
         <w:tc>
           <w:tcPr>
-            <w:tcW w:w="1598" w:type="dxa"/>
+            <w:tcW w:w="1448" w:type="dxa"/>
             <w:tcBorders>
               <w:top w:val="single" w:sz="24" w:space="0" w:color="auto"/>
               <w:left w:val="single" w:sz="24" w:space="0" w:color="auto"/>
@@ -1110,7 +1128,7 @@
           </w:tcPr>
           <w:p>
             <w:pPr>
-              <w:ind w:left="-202"/>
+              <w:ind w:left="18"/>
               <w:jc w:val="center"/>
               <w:rPr>
                 <w:rFonts w:ascii="Aptos Black" w:hAnsi="Aptos Black"/>
@@ -1130,7 +1148,7 @@
         </w:tc>
         <w:tc>
           <w:tcPr>
-            <w:tcW w:w="1873" w:type="dxa"/>
+            <w:tcW w:w="2156" w:type="dxa"/>
             <w:tcBorders>
               <w:top w:val="single" w:sz="24" w:space="0" w:color="auto"/>
               <w:left w:val="dashed" w:sz="4" w:space="0" w:color="auto"/>
@@ -1203,7 +1221,7 @@
         </w:trPr>
         <w:tc>
           <w:tcPr>
-            <w:tcW w:w="1813" w:type="dxa"/>
+            <w:tcW w:w="1276" w:type="dxa"/>
             <w:tcBorders>
               <w:left w:val="single" w:sz="24" w:space="0" w:color="auto"/>
               <w:bottom w:val="single" w:sz="24" w:space="0" w:color="auto"/>
@@ -1257,7 +1275,7 @@
         </w:tc>
         <w:tc>
           <w:tcPr>
-            <w:tcW w:w="1873" w:type="dxa"/>
+            <w:tcW w:w="2298" w:type="dxa"/>
             <w:tcBorders>
               <w:left w:val="dashed" w:sz="4" w:space="0" w:color="auto"/>
               <w:bottom w:val="single" w:sz="24" w:space="0" w:color="auto"/>
@@ -1385,7 +1403,7 @@
         </w:tc>
         <w:tc>
           <w:tcPr>
-            <w:tcW w:w="490" w:type="dxa"/>
+            <w:tcW w:w="357" w:type="dxa"/>
             <w:tcBorders>
               <w:right w:val="single" w:sz="24" w:space="0" w:color="auto"/>
             </w:tcBorders>
@@ -1403,7 +1421,7 @@
         </w:tc>
         <w:tc>
           <w:tcPr>
-            <w:tcW w:w="1598" w:type="dxa"/>
+            <w:tcW w:w="1448" w:type="dxa"/>
             <w:tcBorders>
               <w:left w:val="single" w:sz="24" w:space="0" w:color="auto"/>
               <w:bottom w:val="single" w:sz="24" w:space="0" w:color="auto"/>
@@ -1458,7 +1476,7 @@
         </w:tc>
         <w:tc>
           <w:tcPr>
-            <w:tcW w:w="1873" w:type="dxa"/>
+            <w:tcW w:w="2156" w:type="dxa"/>
             <w:tcBorders>
               <w:left w:val="dashed" w:sz="4" w:space="0" w:color="auto"/>
               <w:bottom w:val="single" w:sz="24" w:space="0" w:color="auto"/>
@@ -1574,7 +1592,7 @@
         </w:trPr>
         <w:tc>
           <w:tcPr>
-            <w:tcW w:w="3686" w:type="dxa"/>
+            <w:tcW w:w="3574" w:type="dxa"/>
             <w:gridSpan w:val="2"/>
             <w:tcBorders>
               <w:top w:val="single" w:sz="24" w:space="0" w:color="auto"/>
@@ -1624,7 +1642,7 @@
         </w:tc>
         <w:tc>
           <w:tcPr>
-            <w:tcW w:w="490" w:type="dxa"/>
+            <w:tcW w:w="357" w:type="dxa"/>
           </w:tcPr>
           <w:p>
             <w:pPr>
@@ -1638,7 +1656,7 @@
         </w:tc>
         <w:tc>
           <w:tcPr>
-            <w:tcW w:w="1598" w:type="dxa"/>
+            <w:tcW w:w="1448" w:type="dxa"/>
             <w:tcBorders>
               <w:top w:val="single" w:sz="24" w:space="0" w:color="auto"/>
             </w:tcBorders>
@@ -1655,7 +1673,7 @@
         </w:tc>
         <w:tc>
           <w:tcPr>
-            <w:tcW w:w="1873" w:type="dxa"/>
+            <w:tcW w:w="2156" w:type="dxa"/>
             <w:tcBorders>
               <w:top w:val="single" w:sz="24" w:space="0" w:color="auto"/>
             </w:tcBorders>
@@ -1695,7 +1713,7 @@
         </w:trPr>
         <w:tc>
           <w:tcPr>
-            <w:tcW w:w="3686" w:type="dxa"/>
+            <w:tcW w:w="3574" w:type="dxa"/>
             <w:gridSpan w:val="2"/>
             <w:tcBorders>
               <w:top w:val="single" w:sz="24" w:space="0" w:color="auto"/>
@@ -1744,7 +1762,25 @@
                 <w:sz w:val="96"/>
                 <w:szCs w:val="96"/>
               </w:rPr>
-              <w:t>«nro»</w:t>
+              <w:t>«</w:t>
+            </w:r>
+            <w:proofErr w:type="spellStart"/>
+            <w:r>
+              <w:rPr>
+                <w:rFonts w:ascii="Aptos Black" w:hAnsi="Aptos Black"/>
+                <w:sz w:val="96"/>
+                <w:szCs w:val="96"/>
+              </w:rPr>
+              <w:t>nro</w:t>
+            </w:r>
+            <w:proofErr w:type="spellEnd"/>
+            <w:r>
+              <w:rPr>
+                <w:rFonts w:ascii="Aptos Black" w:hAnsi="Aptos Black"/>
+                <w:sz w:val="96"/>
+                <w:szCs w:val="96"/>
+              </w:rPr>
+              <w:t>»</w:t>
             </w:r>
             <w:r>
               <w:rPr>
@@ -1783,13 +1819,13 @@
                 <w:szCs w:val="14"/>
               </w:rPr>
               <w:drawing>
-                <wp:anchor distT="0" distB="0" distL="114300" distR="114300" simplePos="0" relativeHeight="251758592" behindDoc="0" locked="0" layoutInCell="1" allowOverlap="1" wp14:anchorId="37540B14" wp14:editId="33DE5053">
+                <wp:anchor distT="0" distB="0" distL="114300" distR="114300" simplePos="0" relativeHeight="251758592" behindDoc="0" locked="0" layoutInCell="1" allowOverlap="1" wp14:anchorId="37540B14" wp14:editId="7CF3F00C">
                   <wp:simplePos x="0" y="0"/>
                   <wp:positionH relativeFrom="column">
-                    <wp:posOffset>29845</wp:posOffset>
+                    <wp:posOffset>20955</wp:posOffset>
                   </wp:positionH>
                   <wp:positionV relativeFrom="paragraph">
-                    <wp:posOffset>85090</wp:posOffset>
+                    <wp:posOffset>45085</wp:posOffset>
                   </wp:positionV>
                   <wp:extent cx="939800" cy="513080"/>
                   <wp:effectExtent l="0" t="0" r="0" b="1270"/>
@@ -1859,18 +1895,18 @@
               <mc:AlternateContent>
                 <mc:Choice Requires="wps">
                   <w:drawing>
-                    <wp:anchor distT="0" distB="0" distL="114300" distR="114300" simplePos="0" relativeHeight="251747328" behindDoc="0" locked="0" layoutInCell="1" allowOverlap="1" wp14:anchorId="368B94ED" wp14:editId="4D1C1234">
+                    <wp:anchor distT="0" distB="0" distL="114300" distR="114300" simplePos="0" relativeHeight="251762688" behindDoc="0" locked="0" layoutInCell="1" allowOverlap="1" wp14:anchorId="6057CDD4" wp14:editId="40DB00D2">
                       <wp:simplePos x="0" y="0"/>
                       <wp:positionH relativeFrom="margin">
-                        <wp:posOffset>-665480</wp:posOffset>
+                        <wp:posOffset>-455930</wp:posOffset>
                       </wp:positionH>
                       <wp:positionV relativeFrom="paragraph">
-                        <wp:posOffset>450850</wp:posOffset>
+                        <wp:posOffset>523240</wp:posOffset>
                       </wp:positionV>
-                      <wp:extent cx="2137410" cy="1768475"/>
+                      <wp:extent cx="1597660" cy="1635125"/>
                       <wp:effectExtent l="0" t="0" r="0" b="0"/>
                       <wp:wrapNone/>
-                      <wp:docPr id="689068553" name="Rectángulo: esquinas redondeadas 689068553"/>
+                      <wp:docPr id="261031384" name="Rectángulo: esquinas redondeadas 261031384"/>
                       <wp:cNvGraphicFramePr>
                         <a:graphicFrameLocks xmlns:a="http://schemas.openxmlformats.org/drawingml/2006/main"/>
                       </wp:cNvGraphicFramePr>
@@ -1883,7 +1919,7 @@
                             <wps:spPr bwMode="auto">
                               <a:xfrm>
                                 <a:off x="0" y="0"/>
-                                <a:ext cx="2137410" cy="1768475"/>
+                                <a:ext cx="1597660" cy="1635125"/>
                               </a:xfrm>
                               <a:prstGeom prst="roundRect">
                                 <a:avLst>
@@ -1902,6 +1938,7 @@
                               <w:txbxContent>
                                 <w:p>
                                   <w:pPr>
+                                    <w:spacing w:before="0" w:after="0"/>
                                     <w:ind w:left="426"/>
                                     <w:jc w:val="center"/>
                                   </w:pPr>
@@ -1966,12 +2003,13 @@
                 </mc:Choice>
                 <mc:Fallback>
                   <w:pict>
-                    <v:roundrect w14:anchorId="368B94ED" id="Rectángulo: esquinas redondeadas 689068553" o:spid="_x0000_s1028" style="position:absolute;left:0;text-align:left;margin-left:-52.4pt;margin-top:35.5pt;width:168.3pt;height:139.25pt;z-index:251747328;visibility:visible;mso-wrap-style:square;mso-width-percent:0;mso-height-percent:0;mso-wrap-distance-left:9pt;mso-wrap-distance-top:0;mso-wrap-distance-right:9pt;mso-wrap-distance-bottom:0;mso-position-horizontal:absolute;mso-position-horizontal-relative:margin;mso-position-vertical:absolute;mso-position-vertical-relative:text;mso-width-percent:0;mso-height-percent:0;mso-width-relative:margin;mso-height-relative:margin;v-text-anchor:top" arcsize="10923f" o:gfxdata="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" filled="f" stroked="f">
+                    <v:roundrect w14:anchorId="6057CDD4" id="Rectángulo: esquinas redondeadas 261031384" o:spid="_x0000_s1028" style="position:absolute;left:0;text-align:left;margin-left:-35.9pt;margin-top:41.2pt;width:125.8pt;height:128.75pt;z-index:251762688;visibility:visible;mso-wrap-style:square;mso-width-percent:0;mso-height-percent:0;mso-wrap-distance-left:9pt;mso-wrap-distance-top:0;mso-wrap-distance-right:9pt;mso-wrap-distance-bottom:0;mso-position-horizontal:absolute;mso-position-horizontal-relative:margin;mso-position-vertical:absolute;mso-position-vertical-relative:text;mso-width-percent:0;mso-height-percent:0;mso-width-relative:margin;mso-height-relative:margin;v-text-anchor:top" arcsize="10923f" o:gfxdata="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" filled="f" stroked="f">
                       <v:stroke joinstyle="miter"/>
                       <v:textbox>
                         <w:txbxContent>
                           <w:p>
                             <w:pPr>
+                              <w:spacing w:before="0" w:after="0"/>
                               <w:ind w:left="426"/>
                               <w:jc w:val="center"/>
                             </w:pPr>
@@ -2048,7 +2086,7 @@
         </w:tc>
         <w:tc>
           <w:tcPr>
-            <w:tcW w:w="490" w:type="dxa"/>
+            <w:tcW w:w="357" w:type="dxa"/>
             <w:tcBorders>
               <w:right w:val="single" w:sz="24" w:space="0" w:color="auto"/>
             </w:tcBorders>
@@ -2066,7 +2104,7 @@
         </w:tc>
         <w:tc>
           <w:tcPr>
-            <w:tcW w:w="3471" w:type="dxa"/>
+            <w:tcW w:w="3604" w:type="dxa"/>
             <w:gridSpan w:val="2"/>
             <w:tcBorders>
               <w:top w:val="single" w:sz="24" w:space="0" w:color="auto"/>
@@ -2145,6 +2183,183 @@
                 <w:szCs w:val="14"/>
               </w:rPr>
             </w:pPr>
+            <w:r>
+              <w:rPr>
+                <w:noProof/>
+                <w:sz w:val="14"/>
+                <w:szCs w:val="14"/>
+              </w:rPr>
+              <mc:AlternateContent>
+                <mc:Choice Requires="wps">
+                  <w:drawing>
+                    <wp:anchor distT="0" distB="0" distL="114300" distR="114300" simplePos="0" relativeHeight="251764736" behindDoc="0" locked="0" layoutInCell="1" allowOverlap="1" wp14:anchorId="126193AA" wp14:editId="69F1F267">
+                      <wp:simplePos x="0" y="0"/>
+                      <wp:positionH relativeFrom="margin">
+                        <wp:posOffset>-431800</wp:posOffset>
+                      </wp:positionH>
+                      <wp:positionV relativeFrom="paragraph">
+                        <wp:posOffset>508635</wp:posOffset>
+                      </wp:positionV>
+                      <wp:extent cx="1597660" cy="1635125"/>
+                      <wp:effectExtent l="0" t="0" r="0" b="0"/>
+                      <wp:wrapNone/>
+                      <wp:docPr id="962923509" name="Rectángulo: esquinas redondeadas 962923509"/>
+                      <wp:cNvGraphicFramePr>
+                        <a:graphicFrameLocks xmlns:a="http://schemas.openxmlformats.org/drawingml/2006/main"/>
+                      </wp:cNvGraphicFramePr>
+                      <a:graphic xmlns:a="http://schemas.openxmlformats.org/drawingml/2006/main">
+                        <a:graphicData uri="http://schemas.microsoft.com/office/word/2010/wordprocessingShape">
+                          <wps:wsp>
+                            <wps:cNvSpPr>
+                              <a:spLocks noChangeArrowheads="1"/>
+                            </wps:cNvSpPr>
+                            <wps:spPr bwMode="auto">
+                              <a:xfrm>
+                                <a:off x="0" y="0"/>
+                                <a:ext cx="1597660" cy="1635125"/>
+                              </a:xfrm>
+                              <a:prstGeom prst="roundRect">
+                                <a:avLst>
+                                  <a:gd name="adj" fmla="val 16667"/>
+                                </a:avLst>
+                              </a:prstGeom>
+                              <a:noFill/>
+                              <a:ln w="9525">
+                                <a:noFill/>
+                                <a:miter lim="800000"/>
+                                <a:headEnd/>
+                                <a:tailEnd/>
+                              </a:ln>
+                            </wps:spPr>
+                            <wps:txbx>
+                              <w:txbxContent>
+                                <w:p>
+                                  <w:pPr>
+                                    <w:spacing w:before="0" w:after="0"/>
+                                    <w:ind w:left="426"/>
+                                    <w:jc w:val="center"/>
+                                  </w:pPr>
+                                  <w:r>
+                                    <w:rPr>
+                                      <w:rFonts w:ascii="Arial" w:eastAsia="Arial Unicode MS" w:hAnsi="Arial"/>
+                                      <w:sz w:val="18"/>
+                                      <w:szCs w:val="18"/>
+                                    </w:rPr>
+                                    <w:fldChar w:fldCharType="begin"/>
+                                  </w:r>
+                                  <w:r>
+                                    <w:rPr>
+                                      <w:rFonts w:ascii="Arial" w:eastAsia="Arial Unicode MS" w:hAnsi="Arial"/>
+                                      <w:sz w:val="18"/>
+                                      <w:szCs w:val="18"/>
+                                    </w:rPr>
+                                    <w:instrText xml:space="preserve"> MERGEFIELD  Image:qr_code  \* MERGEFORMAT </w:instrText>
+                                  </w:r>
+                                  <w:r>
+                                    <w:rPr>
+                                      <w:rFonts w:ascii="Arial" w:eastAsia="Arial Unicode MS" w:hAnsi="Arial"/>
+                                      <w:sz w:val="18"/>
+                                      <w:szCs w:val="18"/>
+                                    </w:rPr>
+                                    <w:fldChar w:fldCharType="separate"/>
+                                  </w:r>
+                                  <w:r>
+                                    <w:rPr>
+                                      <w:rFonts w:ascii="Arial" w:eastAsia="Arial Unicode MS" w:hAnsi="Arial"/>
+                                      <w:noProof/>
+                                      <w:sz w:val="18"/>
+                                      <w:szCs w:val="18"/>
+                                    </w:rPr>
+                                    <w:t>«Image:qr_code»</w:t>
+                                  </w:r>
+                                  <w:r>
+                                    <w:rPr>
+                                      <w:rFonts w:ascii="Arial" w:eastAsia="Arial Unicode MS" w:hAnsi="Arial"/>
+                                      <w:sz w:val="18"/>
+                                      <w:szCs w:val="18"/>
+                                    </w:rPr>
+                                    <w:fldChar w:fldCharType="end"/>
+                                  </w:r>
+                                </w:p>
+                              </w:txbxContent>
+                            </wps:txbx>
+                            <wps:bodyPr rot="0" vertOverflow="clip" horzOverflow="clip" vert="horz" wrap="square" lIns="91440" tIns="45720" rIns="91440" bIns="45720" anchor="t" anchorCtr="0" upright="1">
+                              <a:noAutofit/>
+                            </wps:bodyPr>
+                          </wps:wsp>
+                        </a:graphicData>
+                      </a:graphic>
+                      <wp14:sizeRelH relativeFrom="margin">
+                        <wp14:pctWidth>0</wp14:pctWidth>
+                      </wp14:sizeRelH>
+                      <wp14:sizeRelV relativeFrom="margin">
+                        <wp14:pctHeight>0</wp14:pctHeight>
+                      </wp14:sizeRelV>
+                    </wp:anchor>
+                  </w:drawing>
+                </mc:Choice>
+                <mc:Fallback>
+                  <w:pict>
+                    <v:roundrect w14:anchorId="126193AA" id="Rectángulo: esquinas redondeadas 962923509" o:spid="_x0000_s1029" style="position:absolute;left:0;text-align:left;margin-left:-34pt;margin-top:40.05pt;width:125.8pt;height:128.75pt;z-index:251764736;visibility:visible;mso-wrap-style:square;mso-width-percent:0;mso-height-percent:0;mso-wrap-distance-left:9pt;mso-wrap-distance-top:0;mso-wrap-distance-right:9pt;mso-wrap-distance-bottom:0;mso-position-horizontal:absolute;mso-position-horizontal-relative:margin;mso-position-vertical:absolute;mso-position-vertical-relative:text;mso-width-percent:0;mso-height-percent:0;mso-width-relative:margin;mso-height-relative:margin;v-text-anchor:top" arcsize="10923f" o:gfxdata="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" filled="f" stroked="f">
+                      <v:stroke joinstyle="miter"/>
+                      <v:textbox>
+                        <w:txbxContent>
+                          <w:p>
+                            <w:pPr>
+                              <w:spacing w:before="0" w:after="0"/>
+                              <w:ind w:left="426"/>
+                              <w:jc w:val="center"/>
+                            </w:pPr>
+                            <w:r>
+                              <w:rPr>
+                                <w:rFonts w:ascii="Arial" w:eastAsia="Arial Unicode MS" w:hAnsi="Arial"/>
+                                <w:sz w:val="18"/>
+                                <w:szCs w:val="18"/>
+                              </w:rPr>
+                              <w:fldChar w:fldCharType="begin"/>
+                            </w:r>
+                            <w:r>
+                              <w:rPr>
+                                <w:rFonts w:ascii="Arial" w:eastAsia="Arial Unicode MS" w:hAnsi="Arial"/>
+                                <w:sz w:val="18"/>
+                                <w:szCs w:val="18"/>
+                              </w:rPr>
+                              <w:instrText xml:space="preserve"> MERGEFIELD  Image:qr_code  \* MERGEFORMAT </w:instrText>
+                            </w:r>
+                            <w:r>
+                              <w:rPr>
+                                <w:rFonts w:ascii="Arial" w:eastAsia="Arial Unicode MS" w:hAnsi="Arial"/>
+                                <w:sz w:val="18"/>
+                                <w:szCs w:val="18"/>
+                              </w:rPr>
+                              <w:fldChar w:fldCharType="separate"/>
+                            </w:r>
+                            <w:r>
+                              <w:rPr>
+                                <w:rFonts w:ascii="Arial" w:eastAsia="Arial Unicode MS" w:hAnsi="Arial"/>
+                                <w:noProof/>
+                                <w:sz w:val="18"/>
+                                <w:szCs w:val="18"/>
+                              </w:rPr>
+                              <w:t>«Image:qr_code»</w:t>
+                            </w:r>
+                            <w:r>
+                              <w:rPr>
+                                <w:rFonts w:ascii="Arial" w:eastAsia="Arial Unicode MS" w:hAnsi="Arial"/>
+                                <w:sz w:val="18"/>
+                                <w:szCs w:val="18"/>
+                              </w:rPr>
+                              <w:fldChar w:fldCharType="end"/>
+                            </w:r>
+                          </w:p>
+                        </w:txbxContent>
+                      </v:textbox>
+                      <w10:wrap anchorx="margin"/>
+                    </v:roundrect>
+                  </w:pict>
+                </mc:Fallback>
+              </mc:AlternateContent>
+            </w:r>
             <w:r>
               <w:rPr>
                 <w:noProof/>
@@ -2219,181 +2434,6 @@
                 </wp:anchor>
               </w:drawing>
             </w:r>
-            <w:r>
-              <w:rPr>
-                <w:noProof/>
-                <w:sz w:val="14"/>
-                <w:szCs w:val="14"/>
-              </w:rPr>
-              <mc:AlternateContent>
-                <mc:Choice Requires="wps">
-                  <w:drawing>
-                    <wp:anchor distT="0" distB="0" distL="114300" distR="114300" simplePos="0" relativeHeight="251748352" behindDoc="0" locked="0" layoutInCell="1" allowOverlap="1" wp14:anchorId="2F8DE353" wp14:editId="17E0A094">
-                      <wp:simplePos x="0" y="0"/>
-                      <wp:positionH relativeFrom="margin">
-                        <wp:posOffset>-699135</wp:posOffset>
-                      </wp:positionH>
-                      <wp:positionV relativeFrom="paragraph">
-                        <wp:posOffset>490220</wp:posOffset>
-                      </wp:positionV>
-                      <wp:extent cx="2137410" cy="1768475"/>
-                      <wp:effectExtent l="0" t="0" r="0" b="0"/>
-                      <wp:wrapNone/>
-                      <wp:docPr id="1219665738" name="Rectángulo: esquinas redondeadas 1219665738"/>
-                      <wp:cNvGraphicFramePr>
-                        <a:graphicFrameLocks xmlns:a="http://schemas.openxmlformats.org/drawingml/2006/main"/>
-                      </wp:cNvGraphicFramePr>
-                      <a:graphic xmlns:a="http://schemas.openxmlformats.org/drawingml/2006/main">
-                        <a:graphicData uri="http://schemas.microsoft.com/office/word/2010/wordprocessingShape">
-                          <wps:wsp>
-                            <wps:cNvSpPr>
-                              <a:spLocks noChangeArrowheads="1"/>
-                            </wps:cNvSpPr>
-                            <wps:spPr bwMode="auto">
-                              <a:xfrm>
-                                <a:off x="0" y="0"/>
-                                <a:ext cx="2137410" cy="1768475"/>
-                              </a:xfrm>
-                              <a:prstGeom prst="roundRect">
-                                <a:avLst>
-                                  <a:gd name="adj" fmla="val 16667"/>
-                                </a:avLst>
-                              </a:prstGeom>
-                              <a:noFill/>
-                              <a:ln w="9525">
-                                <a:noFill/>
-                                <a:miter lim="800000"/>
-                                <a:headEnd/>
-                                <a:tailEnd/>
-                              </a:ln>
-                            </wps:spPr>
-                            <wps:txbx>
-                              <w:txbxContent>
-                                <w:p>
-                                  <w:pPr>
-                                    <w:ind w:left="426"/>
-                                    <w:jc w:val="center"/>
-                                  </w:pPr>
-                                  <w:r>
-                                    <w:rPr>
-                                      <w:rFonts w:ascii="Arial" w:eastAsia="Arial Unicode MS" w:hAnsi="Arial"/>
-                                      <w:sz w:val="18"/>
-                                      <w:szCs w:val="18"/>
-                                    </w:rPr>
-                                    <w:fldChar w:fldCharType="begin"/>
-                                  </w:r>
-                                  <w:r>
-                                    <w:rPr>
-                                      <w:rFonts w:ascii="Arial" w:eastAsia="Arial Unicode MS" w:hAnsi="Arial"/>
-                                      <w:sz w:val="18"/>
-                                      <w:szCs w:val="18"/>
-                                    </w:rPr>
-                                    <w:instrText xml:space="preserve"> MERGEFIELD  Image:qr_code  \* MERGEFORMAT </w:instrText>
-                                  </w:r>
-                                  <w:r>
-                                    <w:rPr>
-                                      <w:rFonts w:ascii="Arial" w:eastAsia="Arial Unicode MS" w:hAnsi="Arial"/>
-                                      <w:sz w:val="18"/>
-                                      <w:szCs w:val="18"/>
-                                    </w:rPr>
-                                    <w:fldChar w:fldCharType="separate"/>
-                                  </w:r>
-                                  <w:r>
-                                    <w:rPr>
-                                      <w:rFonts w:ascii="Arial" w:eastAsia="Arial Unicode MS" w:hAnsi="Arial"/>
-                                      <w:noProof/>
-                                      <w:sz w:val="18"/>
-                                      <w:szCs w:val="18"/>
-                                    </w:rPr>
-                                    <w:t>«Image:qr_code»</w:t>
-                                  </w:r>
-                                  <w:r>
-                                    <w:rPr>
-                                      <w:rFonts w:ascii="Arial" w:eastAsia="Arial Unicode MS" w:hAnsi="Arial"/>
-                                      <w:sz w:val="18"/>
-                                      <w:szCs w:val="18"/>
-                                    </w:rPr>
-                                    <w:fldChar w:fldCharType="end"/>
-                                  </w:r>
-                                </w:p>
-                              </w:txbxContent>
-                            </wps:txbx>
-                            <wps:bodyPr rot="0" vertOverflow="clip" horzOverflow="clip" vert="horz" wrap="square" lIns="91440" tIns="45720" rIns="91440" bIns="45720" anchor="t" anchorCtr="0" upright="1">
-                              <a:noAutofit/>
-                            </wps:bodyPr>
-                          </wps:wsp>
-                        </a:graphicData>
-                      </a:graphic>
-                      <wp14:sizeRelH relativeFrom="margin">
-                        <wp14:pctWidth>0</wp14:pctWidth>
-                      </wp14:sizeRelH>
-                      <wp14:sizeRelV relativeFrom="margin">
-                        <wp14:pctHeight>0</wp14:pctHeight>
-                      </wp14:sizeRelV>
-                    </wp:anchor>
-                  </w:drawing>
-                </mc:Choice>
-                <mc:Fallback>
-                  <w:pict>
-                    <v:roundrect w14:anchorId="2F8DE353" id="Rectángulo: esquinas redondeadas 1219665738" o:spid="_x0000_s1029" style="position:absolute;left:0;text-align:left;margin-left:-55.05pt;margin-top:38.6pt;width:168.3pt;height:139.25pt;z-index:251748352;visibility:visible;mso-wrap-style:square;mso-width-percent:0;mso-height-percent:0;mso-wrap-distance-left:9pt;mso-wrap-distance-top:0;mso-wrap-distance-right:9pt;mso-wrap-distance-bottom:0;mso-position-horizontal:absolute;mso-position-horizontal-relative:margin;mso-position-vertical:absolute;mso-position-vertical-relative:text;mso-width-percent:0;mso-height-percent:0;mso-width-relative:margin;mso-height-relative:margin;v-text-anchor:top" arcsize="10923f" o:gfxdata="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" filled="f" stroked="f">
-                      <v:stroke joinstyle="miter"/>
-                      <v:textbox>
-                        <w:txbxContent>
-                          <w:p>
-                            <w:pPr>
-                              <w:ind w:left="426"/>
-                              <w:jc w:val="center"/>
-                            </w:pPr>
-                            <w:r>
-                              <w:rPr>
-                                <w:rFonts w:ascii="Arial" w:eastAsia="Arial Unicode MS" w:hAnsi="Arial"/>
-                                <w:sz w:val="18"/>
-                                <w:szCs w:val="18"/>
-                              </w:rPr>
-                              <w:fldChar w:fldCharType="begin"/>
-                            </w:r>
-                            <w:r>
-                              <w:rPr>
-                                <w:rFonts w:ascii="Arial" w:eastAsia="Arial Unicode MS" w:hAnsi="Arial"/>
-                                <w:sz w:val="18"/>
-                                <w:szCs w:val="18"/>
-                              </w:rPr>
-                              <w:instrText xml:space="preserve"> MERGEFIELD  Image:qr_code  \* MERGEFORMAT </w:instrText>
-                            </w:r>
-                            <w:r>
-                              <w:rPr>
-                                <w:rFonts w:ascii="Arial" w:eastAsia="Arial Unicode MS" w:hAnsi="Arial"/>
-                                <w:sz w:val="18"/>
-                                <w:szCs w:val="18"/>
-                              </w:rPr>
-                              <w:fldChar w:fldCharType="separate"/>
-                            </w:r>
-                            <w:r>
-                              <w:rPr>
-                                <w:rFonts w:ascii="Arial" w:eastAsia="Arial Unicode MS" w:hAnsi="Arial"/>
-                                <w:noProof/>
-                                <w:sz w:val="18"/>
-                                <w:szCs w:val="18"/>
-                              </w:rPr>
-                              <w:t>«Image:qr_code»</w:t>
-                            </w:r>
-                            <w:r>
-                              <w:rPr>
-                                <w:rFonts w:ascii="Arial" w:eastAsia="Arial Unicode MS" w:hAnsi="Arial"/>
-                                <w:sz w:val="18"/>
-                                <w:szCs w:val="18"/>
-                              </w:rPr>
-                              <w:fldChar w:fldCharType="end"/>
-                            </w:r>
-                          </w:p>
-                        </w:txbxContent>
-                      </v:textbox>
-                      <w10:wrap anchorx="margin"/>
-                    </v:roundrect>
-                  </w:pict>
-                </mc:Fallback>
-              </mc:AlternateContent>
-            </w:r>
           </w:p>
         </w:tc>
       </w:tr>
@@ -2404,7 +2444,7 @@
         </w:trPr>
         <w:tc>
           <w:tcPr>
-            <w:tcW w:w="3686" w:type="dxa"/>
+            <w:tcW w:w="3574" w:type="dxa"/>
             <w:gridSpan w:val="2"/>
             <w:tcBorders>
               <w:left w:val="single" w:sz="24" w:space="0" w:color="auto"/>
@@ -2509,7 +2549,7 @@
         </w:tc>
         <w:tc>
           <w:tcPr>
-            <w:tcW w:w="490" w:type="dxa"/>
+            <w:tcW w:w="357" w:type="dxa"/>
             <w:tcBorders>
               <w:right w:val="single" w:sz="24" w:space="0" w:color="auto"/>
             </w:tcBorders>
@@ -2527,7 +2567,7 @@
         </w:tc>
         <w:tc>
           <w:tcPr>
-            <w:tcW w:w="3471" w:type="dxa"/>
+            <w:tcW w:w="3604" w:type="dxa"/>
             <w:gridSpan w:val="2"/>
             <w:tcBorders>
               <w:left w:val="single" w:sz="24" w:space="0" w:color="auto"/>
@@ -2614,7 +2654,7 @@
         </w:trPr>
         <w:tc>
           <w:tcPr>
-            <w:tcW w:w="1813" w:type="dxa"/>
+            <w:tcW w:w="1276" w:type="dxa"/>
             <w:tcBorders>
               <w:top w:val="single" w:sz="24" w:space="0" w:color="auto"/>
               <w:left w:val="single" w:sz="24" w:space="0" w:color="auto"/>
@@ -2623,7 +2663,7 @@
           </w:tcPr>
           <w:p>
             <w:pPr>
-              <w:ind w:left="-202"/>
+              <w:ind w:left="-56"/>
               <w:jc w:val="center"/>
               <w:rPr>
                 <w:rFonts w:ascii="Aptos Black" w:hAnsi="Aptos Black"/>
@@ -2643,7 +2683,7 @@
         </w:tc>
         <w:tc>
           <w:tcPr>
-            <w:tcW w:w="1873" w:type="dxa"/>
+            <w:tcW w:w="2298" w:type="dxa"/>
             <w:tcBorders>
               <w:top w:val="single" w:sz="24" w:space="0" w:color="auto"/>
               <w:left w:val="dashed" w:sz="4" w:space="0" w:color="auto"/>
@@ -2681,6 +2721,42 @@
           </w:tcPr>
           <w:p>
             <w:pPr>
+              <w:jc w:val="center"/>
+              <w:rPr>
+                <w:rFonts w:ascii="Aptos Black" w:hAnsi="Aptos Black"/>
+                <w:sz w:val="22"/>
+                <w:szCs w:val="22"/>
+              </w:rPr>
+            </w:pPr>
+            <w:proofErr w:type="spellStart"/>
+            <w:r>
+              <w:rPr>
+                <w:rFonts w:ascii="Aptos Black" w:hAnsi="Aptos Black"/>
+                <w:sz w:val="22"/>
+                <w:szCs w:val="22"/>
+              </w:rPr>
+              <w:t>N°</w:t>
+            </w:r>
+            <w:proofErr w:type="spellEnd"/>
+            <w:r>
+              <w:rPr>
+                <w:rFonts w:ascii="Aptos Black" w:hAnsi="Aptos Black"/>
+                <w:sz w:val="22"/>
+                <w:szCs w:val="22"/>
+              </w:rPr>
+              <w:t xml:space="preserve"> SACOS</w:t>
+            </w:r>
+          </w:p>
+        </w:tc>
+        <w:tc>
+          <w:tcPr>
+            <w:tcW w:w="50" w:type="dxa"/>
+            <w:tcBorders>
+              <w:left w:val="single" w:sz="24" w:space="0" w:color="auto"/>
+            </w:tcBorders>
+          </w:tcPr>
+          <w:p>
+            <w:pPr>
               <w:ind w:left="-202"/>
               <w:jc w:val="center"/>
               <w:rPr>
@@ -2689,31 +2765,13 @@
                 <w:szCs w:val="22"/>
               </w:rPr>
             </w:pPr>
-            <w:proofErr w:type="spellStart"/>
-            <w:r>
-              <w:rPr>
-                <w:rFonts w:ascii="Aptos Black" w:hAnsi="Aptos Black"/>
-                <w:sz w:val="22"/>
-                <w:szCs w:val="22"/>
-              </w:rPr>
-              <w:t>N°</w:t>
-            </w:r>
-            <w:proofErr w:type="spellEnd"/>
-            <w:r>
-              <w:rPr>
-                <w:rFonts w:ascii="Aptos Black" w:hAnsi="Aptos Black"/>
-                <w:sz w:val="22"/>
-                <w:szCs w:val="22"/>
-              </w:rPr>
-              <w:t xml:space="preserve"> SACOS</w:t>
-            </w:r>
-          </w:p>
-        </w:tc>
-        <w:tc>
-          <w:tcPr>
-            <w:tcW w:w="50" w:type="dxa"/>
-            <w:tcBorders>
-              <w:left w:val="single" w:sz="24" w:space="0" w:color="auto"/>
+          </w:p>
+        </w:tc>
+        <w:tc>
+          <w:tcPr>
+            <w:tcW w:w="357" w:type="dxa"/>
+            <w:tcBorders>
+              <w:right w:val="single" w:sz="24" w:space="0" w:color="auto"/>
             </w:tcBorders>
           </w:tcPr>
           <w:p>
@@ -2730,26 +2788,7 @@
         </w:tc>
         <w:tc>
           <w:tcPr>
-            <w:tcW w:w="490" w:type="dxa"/>
-            <w:tcBorders>
-              <w:right w:val="single" w:sz="24" w:space="0" w:color="auto"/>
-            </w:tcBorders>
-          </w:tcPr>
-          <w:p>
-            <w:pPr>
-              <w:ind w:left="-202"/>
-              <w:jc w:val="center"/>
-              <w:rPr>
-                <w:rFonts w:ascii="Aptos Black" w:hAnsi="Aptos Black"/>
-                <w:sz w:val="22"/>
-                <w:szCs w:val="22"/>
-              </w:rPr>
-            </w:pPr>
-          </w:p>
-        </w:tc>
-        <w:tc>
-          <w:tcPr>
-            <w:tcW w:w="1598" w:type="dxa"/>
+            <w:tcW w:w="1448" w:type="dxa"/>
             <w:tcBorders>
               <w:top w:val="single" w:sz="24" w:space="0" w:color="auto"/>
               <w:left w:val="single" w:sz="24" w:space="0" w:color="auto"/>
@@ -2778,7 +2817,7 @@
         </w:tc>
         <w:tc>
           <w:tcPr>
-            <w:tcW w:w="1873" w:type="dxa"/>
+            <w:tcW w:w="2156" w:type="dxa"/>
             <w:tcBorders>
               <w:top w:val="single" w:sz="24" w:space="0" w:color="auto"/>
               <w:left w:val="dashed" w:sz="4" w:space="0" w:color="auto"/>
@@ -2816,7 +2855,6 @@
           </w:tcPr>
           <w:p>
             <w:pPr>
-              <w:ind w:left="-202"/>
               <w:jc w:val="center"/>
               <w:rPr>
                 <w:rFonts w:ascii="Aptos Black" w:hAnsi="Aptos Black"/>
@@ -2852,7 +2890,7 @@
         </w:trPr>
         <w:tc>
           <w:tcPr>
-            <w:tcW w:w="1813" w:type="dxa"/>
+            <w:tcW w:w="1276" w:type="dxa"/>
             <w:tcBorders>
               <w:left w:val="single" w:sz="24" w:space="0" w:color="auto"/>
               <w:bottom w:val="single" w:sz="24" w:space="0" w:color="auto"/>
@@ -2906,7 +2944,7 @@
         </w:tc>
         <w:tc>
           <w:tcPr>
-            <w:tcW w:w="1873" w:type="dxa"/>
+            <w:tcW w:w="2298" w:type="dxa"/>
             <w:tcBorders>
               <w:left w:val="dashed" w:sz="4" w:space="0" w:color="auto"/>
               <w:bottom w:val="single" w:sz="24" w:space="0" w:color="auto"/>
@@ -3034,7 +3072,7 @@
         </w:tc>
         <w:tc>
           <w:tcPr>
-            <w:tcW w:w="490" w:type="dxa"/>
+            <w:tcW w:w="357" w:type="dxa"/>
             <w:tcBorders>
               <w:right w:val="single" w:sz="24" w:space="0" w:color="auto"/>
             </w:tcBorders>
@@ -3052,7 +3090,7 @@
         </w:tc>
         <w:tc>
           <w:tcPr>
-            <w:tcW w:w="1598" w:type="dxa"/>
+            <w:tcW w:w="1448" w:type="dxa"/>
             <w:tcBorders>
               <w:left w:val="single" w:sz="24" w:space="0" w:color="auto"/>
               <w:bottom w:val="single" w:sz="24" w:space="0" w:color="auto"/>
@@ -3107,7 +3145,7 @@
         </w:tc>
         <w:tc>
           <w:tcPr>
-            <w:tcW w:w="1873" w:type="dxa"/>
+            <w:tcW w:w="2156" w:type="dxa"/>
             <w:tcBorders>
               <w:left w:val="dashed" w:sz="4" w:space="0" w:color="auto"/>
               <w:bottom w:val="single" w:sz="24" w:space="0" w:color="auto"/>
@@ -5275,15 +5313,18 @@
 </file>
 
 <file path=customXml/item1.xml><?xml version="1.0" encoding="utf-8"?>
-<?mso-contentType ?>
-<FormTemplates xmlns="http://schemas.microsoft.com/sharepoint/v3/contenttype/forms">
-  <Display>DocumentLibraryForm</Display>
-  <Edit>DocumentLibraryForm</Edit>
-  <New>DocumentLibraryForm</New>
-</FormTemplates>
+<b:Sources xmlns:b="http://schemas.openxmlformats.org/officeDocument/2006/bibliography" xmlns="http://schemas.openxmlformats.org/officeDocument/2006/bibliography" SelectedStyle="\APASixthEditionOfficeOnline.xsl" StyleName="APA" Version="6"/>
 </file>
 
 <file path=customXml/item2.xml><?xml version="1.0" encoding="utf-8"?>
+<p:properties xmlns:p="http://schemas.microsoft.com/office/2006/metadata/properties" xmlns:xsi="http://www.w3.org/2001/XMLSchema-instance" xmlns:pc="http://schemas.microsoft.com/office/infopath/2007/PartnerControls">
+  <documentManagement>
+    <MediaServiceKeyPoints xmlns="71af3243-3dd4-4a8d-8c0d-dd76da1f02a5" xsi:nil="true"/>
+  </documentManagement>
+</p:properties>
+</file>
+
+<file path=customXml/item3.xml><?xml version="1.0" encoding="utf-8"?>
 <ct:contentTypeSchema xmlns:ct="http://schemas.microsoft.com/office/2006/metadata/contentType" xmlns:ma="http://schemas.microsoft.com/office/2006/metadata/properties/metaAttributes" ct:_="" ma:_="" ma:contentTypeName="Document" ma:contentTypeID="0x01010079F111ED35F8CC479449609E8A0923A6" ma:contentTypeVersion="11" ma:contentTypeDescription="Create a new document." ma:contentTypeScope="" ma:versionID="1c2eb7a32e66fb6e4260f3771546a5e2">
   <xsd:schema xmlns:xsd="http://www.w3.org/2001/XMLSchema" xmlns:xs="http://www.w3.org/2001/XMLSchema" xmlns:p="http://schemas.microsoft.com/office/2006/metadata/properties" xmlns:ns2="71af3243-3dd4-4a8d-8c0d-dd76da1f02a5" xmlns:ns3="16c05727-aa75-4e4a-9b5f-8a80a1165891" targetNamespace="http://schemas.microsoft.com/office/2006/metadata/properties" ma:root="true" ma:fieldsID="04e1f6479c48b08974ba73b5ca973489" ns2:_="" ns3:_="">
     <xsd:import namespace="71af3243-3dd4-4a8d-8c0d-dd76da1f02a5"/>
@@ -5494,27 +5535,34 @@
 </ct:contentTypeSchema>
 </file>
 
-<file path=customXml/item3.xml><?xml version="1.0" encoding="utf-8"?>
-<p:properties xmlns:p="http://schemas.microsoft.com/office/2006/metadata/properties" xmlns:xsi="http://www.w3.org/2001/XMLSchema-instance" xmlns:pc="http://schemas.microsoft.com/office/infopath/2007/PartnerControls">
-  <documentManagement>
-    <MediaServiceKeyPoints xmlns="71af3243-3dd4-4a8d-8c0d-dd76da1f02a5" xsi:nil="true"/>
-  </documentManagement>
-</p:properties>
-</file>
-
 <file path=customXml/item4.xml><?xml version="1.0" encoding="utf-8"?>
-<b:Sources xmlns:b="http://schemas.openxmlformats.org/officeDocument/2006/bibliography" xmlns="http://schemas.openxmlformats.org/officeDocument/2006/bibliography" SelectedStyle="\APASixthEditionOfficeOnline.xsl" StyleName="APA" Version="6"/>
+<?mso-contentType ?>
+<FormTemplates xmlns="http://schemas.microsoft.com/sharepoint/v3/contenttype/forms">
+  <Display>DocumentLibraryForm</Display>
+  <Edit>DocumentLibraryForm</Edit>
+  <New>DocumentLibraryForm</New>
+</FormTemplates>
 </file>
 
 <file path=customXml/itemProps1.xml><?xml version="1.0" encoding="utf-8"?>
-<ds:datastoreItem xmlns:ds="http://schemas.openxmlformats.org/officeDocument/2006/customXml" ds:itemID="{BEA6D05B-AD60-405F-B8DB-FC61ABCDF8E2}">
+<ds:datastoreItem xmlns:ds="http://schemas.openxmlformats.org/officeDocument/2006/customXml" ds:itemID="{C05E5E2B-8667-45BC-BAAD-43E29CCACB41}">
   <ds:schemaRefs>
-    <ds:schemaRef ds:uri="http://schemas.microsoft.com/sharepoint/v3/contenttype/forms"/>
+    <ds:schemaRef ds:uri="http://schemas.openxmlformats.org/officeDocument/2006/bibliography"/>
   </ds:schemaRefs>
 </ds:datastoreItem>
 </file>
 
 <file path=customXml/itemProps2.xml><?xml version="1.0" encoding="utf-8"?>
+<ds:datastoreItem xmlns:ds="http://schemas.openxmlformats.org/officeDocument/2006/customXml" ds:itemID="{B550BB7C-2FBC-4612-9ECE-2EA076035D14}">
+  <ds:schemaRefs>
+    <ds:schemaRef ds:uri="http://schemas.microsoft.com/office/2006/metadata/properties"/>
+    <ds:schemaRef ds:uri="http://schemas.microsoft.com/office/infopath/2007/PartnerControls"/>
+    <ds:schemaRef ds:uri="71af3243-3dd4-4a8d-8c0d-dd76da1f02a5"/>
+  </ds:schemaRefs>
+</ds:datastoreItem>
+</file>
+
+<file path=customXml/itemProps3.xml><?xml version="1.0" encoding="utf-8"?>
 <ds:datastoreItem xmlns:ds="http://schemas.openxmlformats.org/officeDocument/2006/customXml" ds:itemID="{23573660-FE3A-4463-827C-CAE2430F8500}">
   <ds:schemaRefs>
     <ds:schemaRef ds:uri="http://schemas.microsoft.com/office/2006/metadata/contentType"/>
@@ -5533,20 +5581,10 @@
 </ds:datastoreItem>
 </file>
 
-<file path=customXml/itemProps3.xml><?xml version="1.0" encoding="utf-8"?>
-<ds:datastoreItem xmlns:ds="http://schemas.openxmlformats.org/officeDocument/2006/customXml" ds:itemID="{B550BB7C-2FBC-4612-9ECE-2EA076035D14}">
+<file path=customXml/itemProps4.xml><?xml version="1.0" encoding="utf-8"?>
+<ds:datastoreItem xmlns:ds="http://schemas.openxmlformats.org/officeDocument/2006/customXml" ds:itemID="{BEA6D05B-AD60-405F-B8DB-FC61ABCDF8E2}">
   <ds:schemaRefs>
-    <ds:schemaRef ds:uri="http://schemas.microsoft.com/office/2006/metadata/properties"/>
-    <ds:schemaRef ds:uri="http://schemas.microsoft.com/office/infopath/2007/PartnerControls"/>
-    <ds:schemaRef ds:uri="71af3243-3dd4-4a8d-8c0d-dd76da1f02a5"/>
-  </ds:schemaRefs>
-</ds:datastoreItem>
-</file>
-
-<file path=customXml/itemProps4.xml><?xml version="1.0" encoding="utf-8"?>
-<ds:datastoreItem xmlns:ds="http://schemas.openxmlformats.org/officeDocument/2006/customXml" ds:itemID="{C05E5E2B-8667-45BC-BAAD-43E29CCACB41}">
-  <ds:schemaRefs>
-    <ds:schemaRef ds:uri="http://schemas.openxmlformats.org/officeDocument/2006/bibliography"/>
+    <ds:schemaRef ds:uri="http://schemas.microsoft.com/sharepoint/v3/contenttype/forms"/>
   </ds:schemaRefs>
 </ds:datastoreItem>
 </file>
</xml_diff>